<commit_message>
se desconfiguro el documeto
</commit_message>
<xml_diff>
--- a/tarea3.docx
+++ b/tarea3.docx
@@ -149,13 +149,7 @@
         <w:rPr>
           <w:rFonts w:ascii="Arial" w:hAnsi="Arial" w:cs="Arial"/>
         </w:rPr>
-        <w:t xml:space="preserve"> </w:t>
-      </w:r>
-      <w:r>
-        <w:rPr>
-          <w:rFonts w:ascii="Arial" w:hAnsi="Arial" w:cs="Arial"/>
-        </w:rPr>
-        <w:t>Un megabyte (MB) es una unidad de medida de datos que equivale aproximadamente a un millón de bytes o a 1,024 kilobytes, situándose entre el kilobyte (menor) y el gigabyte (mayor) en la escala de almacenamiento. Se utiliza principalmente para cuantificar el tamaño de archivos, como fotos o canciones, y no debe confundirse con el megabit (Mb), que mide la velocidad de conexión; de hecho, un megabyte es ocho veces más grande que un megabit. En términos prácticos, un solo MB puede almacenar cerca de mil páginas de texto plano o un minuto de música en formato comprimido.</w:t>
+        <w:t xml:space="preserve"> Un megabyte (MB) es una unidad de medida de datos que equivale aproximadamente a un millón de bytes o a 1,024 kilobytes, situándose entre el kilobyte (menor) y el gigabyte (mayor) en la escala de almacenamiento. Se utiliza principalmente para cuantificar el tamaño de archivos, como fotos o canciones, y no debe confundirse con el megabit (Mb), que mide la velocidad de conexión; de hecho, un megabyte es ocho veces más grande que un megabit. En términos prácticos, un solo MB puede almacenar cerca de mil páginas de texto plano o un minuto de música en formato comprimido.</w:t>
       </w:r>
     </w:p>
     <w:p>
@@ -476,206 +470,8 @@
         <w:rPr>
           <w:rFonts w:ascii="Arial" w:hAnsi="Arial" w:cs="Arial"/>
         </w:rPr>
-        <w:t>El tiempo estimado de descarga para un archivo de 60 MB con una conexión de 60 Mbps es de 8 segundos.</w:t>
-      </w:r>
-    </w:p>
-    <w:p>
-      <w:pPr>
-        <w:rPr>
-          <w:rFonts w:ascii="Arial" w:hAnsi="Arial" w:cs="Arial"/>
-        </w:rPr>
-      </w:pPr>
-    </w:p>
-    <w:p>
-      <w:pPr>
-        <w:rPr>
-          <w:b/>
-          <w:bCs/>
-        </w:rPr>
-      </w:pPr>
-      <w:r>
-        <w:rPr>
-          <w:b/>
-          <w:bCs/>
-        </w:rPr>
-        <mc:AlternateContent>
-          <mc:Choice Requires="wps">
-            <w:drawing>
-              <wp:inline distT="0" distB="0" distL="0" distR="0" wp14:anchorId="00BE01F0" wp14:editId="5397BC7B">
-                <wp:extent cx="302260" cy="302260"/>
-                <wp:effectExtent l="0" t="0" r="0" b="0"/>
-                <wp:docPr id="3" name="Rectángulo 3"/>
-                <wp:cNvGraphicFramePr>
-                  <a:graphicFrameLocks xmlns:a="http://schemas.openxmlformats.org/drawingml/2006/main" noChangeAspect="1"/>
-                </wp:cNvGraphicFramePr>
-                <a:graphic xmlns:a="http://schemas.openxmlformats.org/drawingml/2006/main">
-                  <a:graphicData uri="http://schemas.microsoft.com/office/word/2010/wordprocessingShape">
-                    <wps:wsp>
-                      <wps:cNvSpPr>
-                        <a:spLocks noChangeAspect="1" noChangeArrowheads="1"/>
-                      </wps:cNvSpPr>
-                      <wps:spPr bwMode="auto">
-                        <a:xfrm>
-                          <a:off x="0" y="0"/>
-                          <a:ext cx="302260" cy="302260"/>
-                        </a:xfrm>
-                        <a:prstGeom prst="rect">
-                          <a:avLst/>
-                        </a:prstGeom>
-                        <a:noFill/>
-                        <a:ln>
-                          <a:noFill/>
-                        </a:ln>
-                        <a:extLst>
-                          <a:ext uri="{909E8E84-426E-40DD-AFC4-6F175D3DCCD1}">
-                            <a14:hiddenFill xmlns:a14="http://schemas.microsoft.com/office/drawing/2010/main">
-                              <a:solidFill>
-                                <a:srgbClr val="FFFFFF"/>
-                              </a:solidFill>
-                            </a14:hiddenFill>
-                          </a:ext>
-                          <a:ext uri="{91240B29-F687-4F45-9708-019B960494DF}">
-                            <a14:hiddenLine xmlns:a14="http://schemas.microsoft.com/office/drawing/2010/main" w="9525">
-                              <a:solidFill>
-                                <a:srgbClr val="000000"/>
-                              </a:solidFill>
-                              <a:miter lim="800000"/>
-                              <a:headEnd/>
-                              <a:tailEnd/>
-                            </a14:hiddenLine>
-                          </a:ext>
-                        </a:extLst>
-                      </wps:spPr>
-                      <wps:bodyPr rot="0" vert="horz" wrap="square" lIns="91440" tIns="45720" rIns="91440" bIns="45720" anchor="t" anchorCtr="0" upright="1">
-                        <a:noAutofit/>
-                      </wps:bodyPr>
-                    </wps:wsp>
-                  </a:graphicData>
-                </a:graphic>
-              </wp:inline>
-            </w:drawing>
-          </mc:Choice>
-          <mc:Fallback>
-            <w:pict>
-              <v:rect w14:anchorId="0026E2B7" id="Rectángulo 3" o:spid="_x0000_s1026" style="width:23.8pt;height:23.8pt;visibility:visible;mso-wrap-style:square;mso-left-percent:-10001;mso-top-percent:-10001;mso-position-horizontal:absolute;mso-position-horizontal-relative:char;mso-position-vertical:absolute;mso-position-vertical-relative:line;mso-left-percent:-10001;mso-top-percent:-10001;v-text-anchor:top" o:gfxdata="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" filled="f" stroked="f">
-                <o:lock v:ext="edit" aspectratio="t"/>
-                <w10:anchorlock/>
-              </v:rect>
-            </w:pict>
-          </mc:Fallback>
-        </mc:AlternateContent>
-      </w:r>
-    </w:p>
-    <w:p>
-      <w:pPr>
-        <w:rPr>
-          <w:b/>
-          <w:bCs/>
-        </w:rPr>
-      </w:pPr>
-      <w:r>
-        <w:rPr>
-          <w:b/>
-          <w:bCs/>
-        </w:rPr>
-        <mc:AlternateContent>
-          <mc:Choice Requires="wps">
-            <w:drawing>
-              <wp:inline distT="0" distB="0" distL="0" distR="0" wp14:anchorId="145D0651" wp14:editId="50F85ACC">
-                <wp:extent cx="302260" cy="302260"/>
-                <wp:effectExtent l="0" t="0" r="0" b="0"/>
-                <wp:docPr id="2" name="Rectángulo 2"/>
-                <wp:cNvGraphicFramePr>
-                  <a:graphicFrameLocks xmlns:a="http://schemas.openxmlformats.org/drawingml/2006/main" noChangeAspect="1"/>
-                </wp:cNvGraphicFramePr>
-                <a:graphic xmlns:a="http://schemas.openxmlformats.org/drawingml/2006/main">
-                  <a:graphicData uri="http://schemas.microsoft.com/office/word/2010/wordprocessingShape">
-                    <wps:wsp>
-                      <wps:cNvSpPr>
-                        <a:spLocks noChangeAspect="1" noChangeArrowheads="1"/>
-                      </wps:cNvSpPr>
-                      <wps:spPr bwMode="auto">
-                        <a:xfrm>
-                          <a:off x="0" y="0"/>
-                          <a:ext cx="302260" cy="302260"/>
-                        </a:xfrm>
-                        <a:prstGeom prst="rect">
-                          <a:avLst/>
-                        </a:prstGeom>
-                        <a:noFill/>
-                        <a:ln>
-                          <a:noFill/>
-                        </a:ln>
-                        <a:extLst>
-                          <a:ext uri="{909E8E84-426E-40DD-AFC4-6F175D3DCCD1}">
-                            <a14:hiddenFill xmlns:a14="http://schemas.microsoft.com/office/drawing/2010/main">
-                              <a:solidFill>
-                                <a:srgbClr val="FFFFFF"/>
-                              </a:solidFill>
-                            </a14:hiddenFill>
-                          </a:ext>
-                          <a:ext uri="{91240B29-F687-4F45-9708-019B960494DF}">
-                            <a14:hiddenLine xmlns:a14="http://schemas.microsoft.com/office/drawing/2010/main" w="9525">
-                              <a:solidFill>
-                                <a:srgbClr val="000000"/>
-                              </a:solidFill>
-                              <a:miter lim="800000"/>
-                              <a:headEnd/>
-                              <a:tailEnd/>
-                            </a14:hiddenLine>
-                          </a:ext>
-                        </a:extLst>
-                      </wps:spPr>
-                      <wps:bodyPr rot="0" vert="horz" wrap="square" lIns="91440" tIns="45720" rIns="91440" bIns="45720" anchor="t" anchorCtr="0" upright="1">
-                        <a:noAutofit/>
-                      </wps:bodyPr>
-                    </wps:wsp>
-                  </a:graphicData>
-                </a:graphic>
-              </wp:inline>
-            </w:drawing>
-          </mc:Choice>
-          <mc:Fallback>
-            <w:pict>
-              <v:rect w14:anchorId="160499F7" id="Rectángulo 2" o:spid="_x0000_s1026" style="width:23.8pt;height:23.8pt;visibility:visible;mso-wrap-style:square;mso-left-percent:-10001;mso-top-percent:-10001;mso-position-horizontal:absolute;mso-position-horizontal-relative:char;mso-position-vertical:absolute;mso-position-vertical-relative:line;mso-left-percent:-10001;mso-top-percent:-10001;v-text-anchor:top" o:gfxdata="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" filled="f" stroked="f">
-                <o:lock v:ext="edit" aspectratio="t"/>
-                <w10:anchorlock/>
-              </v:rect>
-            </w:pict>
-          </mc:Fallback>
-        </mc:AlternateContent>
-      </w:r>
-    </w:p>
-    <w:p>
-      <w:pPr>
-        <w:rPr>
-          <w:b/>
-          <w:bCs/>
-        </w:rPr>
-      </w:pPr>
-      <w:r>
-        <w:rPr>
-          <w:b/>
-          <w:bCs/>
-        </w:rPr>
-        <w:t>.</w:t>
-      </w:r>
-    </w:p>
-    <w:p>
-      <w:pPr>
-        <w:rPr>
-          <w:b/>
-          <w:bCs/>
-        </w:rPr>
-      </w:pPr>
-    </w:p>
-    <w:p>
-      <w:pPr>
-        <w:rPr>
-          <w:b/>
-          <w:bCs/>
-        </w:rPr>
-      </w:pPr>
+        <w:t>El tiempo estimado de descarga para un archivo de 60 MB con una conexión de 60 Mbps es de 8 segundos</w:t>
+      </w:r>
     </w:p>
     <w:sectPr>
       <w:pgSz w:w="11906" w:h="16838"/>
@@ -969,29 +765,11 @@
   </w:num>
   <w:num w:numId="3">
     <w:abstractNumId w:val="1"/>
-    <w:lvlOverride w:ilvl="1">
-      <w:lvl w:ilvl="1">
-        <w:numFmt w:val="decimal"/>
-        <w:lvlText w:val="%2."/>
-        <w:lvlJc w:val="left"/>
-      </w:lvl>
-    </w:lvlOverride>
+    <w:lvlOverride w:ilvl="0"/>
   </w:num>
   <w:num w:numId="4">
     <w:abstractNumId w:val="1"/>
-    <w:lvlOverride w:ilvl="1">
-      <w:lvl w:ilvl="1">
-        <w:numFmt w:val="decimal"/>
-        <w:lvlText w:val="%2."/>
-        <w:lvlJc w:val="left"/>
-        <w:pPr>
-          <w:tabs>
-            <w:tab w:val="num" w:pos="1440"/>
-          </w:tabs>
-          <w:ind w:left="1440" w:hanging="360"/>
-        </w:pPr>
-      </w:lvl>
-    </w:lvlOverride>
+    <w:lvlOverride w:ilvl="0"/>
   </w:num>
 </w:numbering>
 </file>
@@ -1398,6 +1176,7 @@
   <w:style w:type="character" w:default="1" w:styleId="Fuentedeprrafopredeter">
     <w:name w:val="Default Paragraph Font"/>
     <w:uiPriority w:val="1"/>
+    <w:semiHidden/>
     <w:unhideWhenUsed/>
   </w:style>
   <w:style w:type="table" w:default="1" w:styleId="Tablanormal">

</xml_diff>